<commit_message>
fix: 作业10.1 - doc
</commit_message>
<xml_diff>
--- a/myspace/10/作业10.1.docx
+++ b/myspace/10/作业10.1.docx
@@ -3724,9 +3724,26 @@
         </w:rPr>
         <w:t>（1）</w:t>
       </w:r>
-      <w:r>
-        <w:t>视觉识别调试截图</w:t>
-      </w:r>
+      <w:hyperlink r:id="rId21" w:history="1">
+        <w:r>
+          <w:rPr>
+            <w:rStyle w:val="af2"/>
+          </w:rPr>
+          <w:t>视觉识别调</w:t>
+        </w:r>
+        <w:r>
+          <w:rPr>
+            <w:rStyle w:val="af2"/>
+          </w:rPr>
+          <w:t>试</w:t>
+        </w:r>
+        <w:r>
+          <w:rPr>
+            <w:rStyle w:val="af2"/>
+          </w:rPr>
+          <w:t>截图</w:t>
+        </w:r>
+      </w:hyperlink>
     </w:p>
     <w:p>
       <w:pPr>
@@ -3754,15 +3771,26 @@
         </w:rPr>
         <w:t>（1）</w:t>
       </w:r>
-      <w:r>
-        <w:t>视觉回传</w:t>
-      </w:r>
-      <w:r>
-        <w:rPr>
-          <w:rFonts w:hint="eastAsia"/>
-        </w:rPr>
-        <w:t>对比分析</w:t>
-      </w:r>
+      <w:hyperlink r:id="rId22" w:history="1">
+        <w:r>
+          <w:rPr>
+            <w:rStyle w:val="af2"/>
+          </w:rPr>
+          <w:t>视觉回传</w:t>
+        </w:r>
+        <w:r>
+          <w:rPr>
+            <w:rStyle w:val="af2"/>
+          </w:rPr>
+          <w:t>对</w:t>
+        </w:r>
+        <w:r>
+          <w:rPr>
+            <w:rStyle w:val="af2"/>
+          </w:rPr>
+          <w:t>比分析</w:t>
+        </w:r>
+      </w:hyperlink>
     </w:p>
     <w:p>
       <w:pPr>
@@ -3787,9 +3815,26 @@
         </w:rPr>
         <w:t>（1）</w:t>
       </w:r>
-      <w:r>
-        <w:t>识别流程截图</w:t>
-      </w:r>
+      <w:hyperlink r:id="rId23" w:history="1">
+        <w:r>
+          <w:rPr>
+            <w:rStyle w:val="af2"/>
+          </w:rPr>
+          <w:t>识别流程</w:t>
+        </w:r>
+        <w:r>
+          <w:rPr>
+            <w:rStyle w:val="af2"/>
+          </w:rPr>
+          <w:t>截</w:t>
+        </w:r>
+        <w:r>
+          <w:rPr>
+            <w:rStyle w:val="af2"/>
+          </w:rPr>
+          <w:t>图</w:t>
+        </w:r>
+      </w:hyperlink>
     </w:p>
     <w:p>
       <w:pPr>
@@ -3805,9 +3850,26 @@
         </w:rPr>
         <w:t>（2）</w:t>
       </w:r>
-      <w:r>
-        <w:t>动作执行效果截图</w:t>
-      </w:r>
+      <w:hyperlink r:id="rId24" w:history="1">
+        <w:r>
+          <w:rPr>
+            <w:rStyle w:val="af2"/>
+          </w:rPr>
+          <w:t>动作执行</w:t>
+        </w:r>
+        <w:r>
+          <w:rPr>
+            <w:rStyle w:val="af2"/>
+          </w:rPr>
+          <w:t>效</w:t>
+        </w:r>
+        <w:r>
+          <w:rPr>
+            <w:rStyle w:val="af2"/>
+          </w:rPr>
+          <w:t>果截图</w:t>
+        </w:r>
+      </w:hyperlink>
     </w:p>
     <w:p>
       <w:pPr>
@@ -3886,9 +3948,26 @@
         </w:rPr>
         <w:t>（1）</w:t>
       </w:r>
-      <w:r>
-        <w:t>额外功能说明</w:t>
-      </w:r>
+      <w:hyperlink r:id="rId25" w:history="1">
+        <w:r>
+          <w:rPr>
+            <w:rStyle w:val="af2"/>
+          </w:rPr>
+          <w:t>额外功能</w:t>
+        </w:r>
+        <w:r>
+          <w:rPr>
+            <w:rStyle w:val="af2"/>
+          </w:rPr>
+          <w:t>说</w:t>
+        </w:r>
+        <w:r>
+          <w:rPr>
+            <w:rStyle w:val="af2"/>
+          </w:rPr>
+          <w:t>明</w:t>
+        </w:r>
+      </w:hyperlink>
     </w:p>
     <w:p>
       <w:pPr>
@@ -3903,9 +3982,26 @@
         </w:rPr>
         <w:t>（2）</w:t>
       </w:r>
-      <w:r>
-        <w:t>效果截图</w:t>
-      </w:r>
+      <w:hyperlink r:id="rId26" w:history="1">
+        <w:r>
+          <w:rPr>
+            <w:rStyle w:val="af2"/>
+          </w:rPr>
+          <w:t>效果</w:t>
+        </w:r>
+        <w:r>
+          <w:rPr>
+            <w:rStyle w:val="af2"/>
+          </w:rPr>
+          <w:t>截</w:t>
+        </w:r>
+        <w:r>
+          <w:rPr>
+            <w:rStyle w:val="af2"/>
+          </w:rPr>
+          <w:t>图</w:t>
+        </w:r>
+      </w:hyperlink>
     </w:p>
     <w:p>
       <w:pPr>
@@ -6382,6 +6478,41 @@
       <w:szCs w:val="20"/>
     </w:rPr>
   </w:style>
+  <w:style w:type="character" w:styleId="af2">
+    <w:name w:val="Hyperlink"/>
+    <w:basedOn w:val="a0"/>
+    <w:uiPriority w:val="99"/>
+    <w:unhideWhenUsed/>
+    <w:rsid w:val="00E63C5D"/>
+    <w:rPr>
+      <w:color w:val="467886" w:themeColor="hyperlink"/>
+      <w:u w:val="single"/>
+    </w:rPr>
+  </w:style>
+  <w:style w:type="character" w:styleId="af3">
+    <w:name w:val="Unresolved Mention"/>
+    <w:basedOn w:val="a0"/>
+    <w:uiPriority w:val="99"/>
+    <w:semiHidden/>
+    <w:unhideWhenUsed/>
+    <w:rsid w:val="00E63C5D"/>
+    <w:rPr>
+      <w:color w:val="605E5C"/>
+      <w:shd w:val="clear" w:color="auto" w:fill="E1DFDD"/>
+    </w:rPr>
+  </w:style>
+  <w:style w:type="character" w:styleId="af4">
+    <w:name w:val="FollowedHyperlink"/>
+    <w:basedOn w:val="a0"/>
+    <w:uiPriority w:val="99"/>
+    <w:semiHidden/>
+    <w:unhideWhenUsed/>
+    <w:rsid w:val="00E63C5D"/>
+    <w:rPr>
+      <w:color w:val="96607D" w:themeColor="followedHyperlink"/>
+      <w:u w:val="single"/>
+    </w:rPr>
+  </w:style>
 </w:styles>
 </file>
 

</xml_diff>